<commit_message>
refactor: refatora layout da página de cadastro de questões, seus componentes e o fluxo de todas os endpoints do dominio de questão principal
</commit_message>
<xml_diff>
--- a/melhorias_docs/Report-generator melhorias v2.docx
+++ b/melhorias_docs/Report-generator melhorias v2.docx
@@ -33,7 +33,499 @@
       </w:r>
     </w:p>
     <w:p>
-      <w:r>
+      <w:pPr>
+        <w:rPr>
+          <w:highlight w:val="lightGray"/>
+        </w:rPr>
+      </w:pPr>
+      <w:r>
+        <w:t xml:space="preserve">- </w:t>
+      </w:r>
+      <w:r>
+        <w:rPr>
+          <w:b/>
+          <w:highlight w:val="lightGray"/>
+        </w:rPr>
+        <w:t>Reordenar questões do simulados</w:t>
+      </w:r>
+    </w:p>
+    <w:p>
+      <w:pPr>
+        <w:rPr>
+          <w:highlight w:val="lightGray"/>
+        </w:rPr>
+      </w:pPr>
+      <w:r>
+        <w:rPr>
+          <w:highlight w:val="lightGray"/>
+        </w:rPr>
+        <w:tab/>
+        <w:t xml:space="preserve">- </w:t>
+      </w:r>
+      <w:proofErr w:type="spellStart"/>
+      <w:proofErr w:type="gramStart"/>
+      <w:r>
+        <w:rPr>
+          <w:highlight w:val="lightGray"/>
+        </w:rPr>
+        <w:t>frontend</w:t>
+      </w:r>
+      <w:proofErr w:type="spellEnd"/>
+      <w:proofErr w:type="gramEnd"/>
+      <w:r>
+        <w:rPr>
+          <w:highlight w:val="lightGray"/>
+        </w:rPr>
+        <w:t xml:space="preserve">: usar a estratégia de ir criando no front e só mandar para o </w:t>
+      </w:r>
+      <w:proofErr w:type="spellStart"/>
+      <w:r>
+        <w:rPr>
+          <w:highlight w:val="lightGray"/>
+        </w:rPr>
+        <w:t>backend</w:t>
+      </w:r>
+      <w:proofErr w:type="spellEnd"/>
+      <w:r>
+        <w:rPr>
+          <w:highlight w:val="lightGray"/>
+        </w:rPr>
+        <w:t xml:space="preserve"> depois de finalizar (usar biblioteca de </w:t>
+      </w:r>
+      <w:proofErr w:type="spellStart"/>
+      <w:r>
+        <w:rPr>
+          <w:highlight w:val="lightGray"/>
+        </w:rPr>
+        <w:t>drag</w:t>
+      </w:r>
+      <w:proofErr w:type="spellEnd"/>
+      <w:r>
+        <w:rPr>
+          <w:highlight w:val="lightGray"/>
+        </w:rPr>
+        <w:t xml:space="preserve"> </w:t>
+      </w:r>
+      <w:proofErr w:type="spellStart"/>
+      <w:r>
+        <w:rPr>
+          <w:highlight w:val="lightGray"/>
+        </w:rPr>
+        <w:t>and</w:t>
+      </w:r>
+      <w:proofErr w:type="spellEnd"/>
+      <w:r>
+        <w:rPr>
+          <w:highlight w:val="lightGray"/>
+        </w:rPr>
+        <w:t xml:space="preserve"> </w:t>
+      </w:r>
+      <w:proofErr w:type="spellStart"/>
+      <w:r>
+        <w:rPr>
+          <w:highlight w:val="lightGray"/>
+        </w:rPr>
+        <w:t>drop</w:t>
+      </w:r>
+      <w:proofErr w:type="spellEnd"/>
+      <w:r>
+        <w:rPr>
+          <w:highlight w:val="lightGray"/>
+        </w:rPr>
+        <w:t xml:space="preserve"> para reorganizar as questões no simulado)</w:t>
+      </w:r>
+      <w:r>
+        <w:rPr>
+          <w:highlight w:val="lightGray"/>
+        </w:rPr>
+        <w:t>.</w:t>
+      </w:r>
+    </w:p>
+    <w:p>
+      <w:pPr>
+        <w:rPr>
+          <w:highlight w:val="lightGray"/>
+        </w:rPr>
+      </w:pPr>
+      <w:r>
+        <w:rPr>
+          <w:highlight w:val="lightGray"/>
+        </w:rPr>
+        <w:tab/>
+        <w:t xml:space="preserve">- </w:t>
+      </w:r>
+      <w:proofErr w:type="spellStart"/>
+      <w:proofErr w:type="gramStart"/>
+      <w:r>
+        <w:rPr>
+          <w:highlight w:val="lightGray"/>
+        </w:rPr>
+        <w:t>backend</w:t>
+      </w:r>
+      <w:proofErr w:type="spellEnd"/>
+      <w:proofErr w:type="gramEnd"/>
+      <w:r>
+        <w:rPr>
+          <w:highlight w:val="lightGray"/>
+        </w:rPr>
+        <w:t xml:space="preserve">: </w:t>
+      </w:r>
+      <w:proofErr w:type="spellStart"/>
+      <w:r>
+        <w:rPr>
+          <w:highlight w:val="lightGray"/>
+        </w:rPr>
+        <w:t>refatorar</w:t>
+      </w:r>
+      <w:proofErr w:type="spellEnd"/>
+      <w:r>
+        <w:rPr>
+          <w:highlight w:val="lightGray"/>
+        </w:rPr>
+        <w:t xml:space="preserve"> a rota para receber a entidade completa ou a lista ordenada de ids das questões.</w:t>
+      </w:r>
+    </w:p>
+    <w:p>
+      <w:pPr>
+        <w:rPr>
+          <w:b/>
+          <w:highlight w:val="lightGray"/>
+        </w:rPr>
+      </w:pPr>
+      <w:r>
+        <w:rPr>
+          <w:highlight w:val="lightGray"/>
+        </w:rPr>
+        <w:t xml:space="preserve">- </w:t>
+      </w:r>
+      <w:r>
+        <w:rPr>
+          <w:b/>
+          <w:highlight w:val="lightGray"/>
+        </w:rPr>
+        <w:t>Duplicar simulado</w:t>
+      </w:r>
+    </w:p>
+    <w:p>
+      <w:pPr>
+        <w:rPr>
+          <w:highlight w:val="lightGray"/>
+        </w:rPr>
+      </w:pPr>
+      <w:r>
+        <w:rPr>
+          <w:b/>
+          <w:highlight w:val="lightGray"/>
+        </w:rPr>
+        <w:tab/>
+      </w:r>
+      <w:r>
+        <w:rPr>
+          <w:highlight w:val="lightGray"/>
+        </w:rPr>
+        <w:t xml:space="preserve">- </w:t>
+      </w:r>
+      <w:proofErr w:type="spellStart"/>
+      <w:proofErr w:type="gramStart"/>
+      <w:r>
+        <w:rPr>
+          <w:highlight w:val="lightGray"/>
+        </w:rPr>
+        <w:t>frontend</w:t>
+      </w:r>
+      <w:proofErr w:type="spellEnd"/>
+      <w:proofErr w:type="gramEnd"/>
+      <w:r>
+        <w:rPr>
+          <w:highlight w:val="lightGray"/>
+        </w:rPr>
+        <w:t>: implementar o ícone para esse funcionalidade.</w:t>
+      </w:r>
+    </w:p>
+    <w:p>
+      <w:r>
+        <w:rPr>
+          <w:b/>
+          <w:highlight w:val="lightGray"/>
+        </w:rPr>
+        <w:tab/>
+        <w:t xml:space="preserve">- </w:t>
+      </w:r>
+      <w:proofErr w:type="spellStart"/>
+      <w:proofErr w:type="gramStart"/>
+      <w:r>
+        <w:rPr>
+          <w:highlight w:val="lightGray"/>
+        </w:rPr>
+        <w:t>backend</w:t>
+      </w:r>
+      <w:proofErr w:type="spellEnd"/>
+      <w:proofErr w:type="gramEnd"/>
+      <w:r>
+        <w:rPr>
+          <w:highlight w:val="lightGray"/>
+        </w:rPr>
+        <w:t xml:space="preserve">: criar </w:t>
+      </w:r>
+      <w:proofErr w:type="spellStart"/>
+      <w:r>
+        <w:rPr>
+          <w:highlight w:val="lightGray"/>
+        </w:rPr>
+        <w:t>endpoint</w:t>
+      </w:r>
+      <w:proofErr w:type="spellEnd"/>
+      <w:r>
+        <w:rPr>
+          <w:highlight w:val="lightGray"/>
+        </w:rPr>
+        <w:t xml:space="preserve"> dedicado para duplicar simulado.</w:t>
+      </w:r>
+    </w:p>
+    <w:p/>
+    <w:p>
+      <w:r>
+        <w:t>CADASTRO DE ALUNOS</w:t>
+      </w:r>
+    </w:p>
+    <w:p>
+      <w:pPr>
+        <w:rPr>
+          <w:b/>
+        </w:rPr>
+      </w:pPr>
+      <w:r>
+        <w:t xml:space="preserve">- </w:t>
+      </w:r>
+      <w:r>
+        <w:rPr>
+          <w:b/>
+          <w:highlight w:val="yellow"/>
+        </w:rPr>
+        <w:t xml:space="preserve">Fazer importação em massa a partir de tabela do </w:t>
+      </w:r>
+      <w:proofErr w:type="spellStart"/>
+      <w:r>
+        <w:rPr>
+          <w:b/>
+          <w:highlight w:val="yellow"/>
+        </w:rPr>
+        <w:t>excel</w:t>
+      </w:r>
+      <w:proofErr w:type="spellEnd"/>
+    </w:p>
+    <w:p>
+      <w:r>
+        <w:rPr>
+          <w:b/>
+        </w:rPr>
+        <w:tab/>
+        <w:t xml:space="preserve">- </w:t>
+      </w:r>
+      <w:proofErr w:type="spellStart"/>
+      <w:proofErr w:type="gramStart"/>
+      <w:r>
+        <w:t>frontend</w:t>
+      </w:r>
+      <w:proofErr w:type="spellEnd"/>
+      <w:proofErr w:type="gramEnd"/>
+      <w:r>
+        <w:t xml:space="preserve">: </w:t>
+      </w:r>
+      <w:proofErr w:type="spellStart"/>
+      <w:r>
+        <w:t>refatorar</w:t>
+      </w:r>
+      <w:proofErr w:type="spellEnd"/>
+      <w:r>
+        <w:t xml:space="preserve"> a página de cadastro de criação.</w:t>
+      </w:r>
+    </w:p>
+    <w:p>
+      <w:r>
+        <w:tab/>
+        <w:t xml:space="preserve">- </w:t>
+      </w:r>
+      <w:proofErr w:type="spellStart"/>
+      <w:proofErr w:type="gramStart"/>
+      <w:r>
+        <w:t>backend</w:t>
+      </w:r>
+      <w:proofErr w:type="spellEnd"/>
+      <w:proofErr w:type="gramEnd"/>
+      <w:r>
+        <w:t>: criar uma rota dedicada para criação de cadastro de alunos em massa.</w:t>
+      </w:r>
+    </w:p>
+    <w:p/>
+    <w:p>
+      <w:r>
+        <w:t xml:space="preserve">CADASTRO DE QUESTÕES </w:t>
+      </w:r>
+    </w:p>
+    <w:p>
+      <w:r>
+        <w:t xml:space="preserve">- </w:t>
+      </w:r>
+      <w:proofErr w:type="spellStart"/>
+      <w:r>
+        <w:rPr>
+          <w:b/>
+          <w:highlight w:val="red"/>
+        </w:rPr>
+        <w:t>Refatoração</w:t>
+      </w:r>
+      <w:proofErr w:type="spellEnd"/>
+      <w:r>
+        <w:rPr>
+          <w:b/>
+          <w:highlight w:val="red"/>
+        </w:rPr>
+        <w:t xml:space="preserve"> do layout da página de cadastro de questões:</w:t>
+      </w:r>
+      <w:r>
+        <w:rPr>
+          <w:b/>
+        </w:rPr>
+        <w:t xml:space="preserve"> (1)</w:t>
+      </w:r>
+    </w:p>
+    <w:p>
+      <w:pPr>
+        <w:ind w:firstLine="708"/>
+      </w:pPr>
+      <w:r>
+        <w:t>- Remover campo de descrição de alternativas</w:t>
+      </w:r>
+      <w:r>
+        <w:t>.</w:t>
+      </w:r>
+    </w:p>
+    <w:p>
+      <w:pPr>
+        <w:ind w:firstLine="708"/>
+      </w:pPr>
+      <w:r>
+        <w:t>- Colocar gabar</w:t>
+      </w:r>
+      <w:r>
+        <w:t>ito como campo único de seleção.</w:t>
+      </w:r>
+    </w:p>
+    <w:p>
+      <w:pPr>
+        <w:ind w:firstLine="708"/>
+      </w:pPr>
+      <w:r>
+        <w:t>- Inserir campo de</w:t>
+      </w:r>
+      <w:r>
+        <w:t xml:space="preserve"> assunto no cadastro da questão (inserir o </w:t>
+      </w:r>
+      <w:r>
+        <w:rPr>
+          <w:u w:val="single"/>
+        </w:rPr>
+        <w:t>vínculo</w:t>
+      </w:r>
+      <w:r>
+        <w:t xml:space="preserve"> no momento do cadastro).</w:t>
+      </w:r>
+    </w:p>
+    <w:p>
+      <w:pPr>
+        <w:ind w:firstLine="708"/>
+      </w:pPr>
+      <w:r>
+        <w:t xml:space="preserve">- Aumentar tamanho do </w:t>
+      </w:r>
+      <w:proofErr w:type="spellStart"/>
+      <w:r>
+        <w:t>preview</w:t>
+      </w:r>
+      <w:proofErr w:type="spellEnd"/>
+      <w:r>
+        <w:t xml:space="preserve"> das questões adaptadas</w:t>
+      </w:r>
+      <w:r>
+        <w:t>.</w:t>
+      </w:r>
+    </w:p>
+    <w:p/>
+    <w:p>
+      <w:r>
+        <w:t>ADICIONAR DIAGNÓSTICOS</w:t>
+      </w:r>
+    </w:p>
+    <w:p>
+      <w:pPr>
+        <w:rPr>
+          <w:b/>
+        </w:rPr>
+      </w:pPr>
+      <w:r>
+        <w:t xml:space="preserve">- </w:t>
+      </w:r>
+      <w:r>
+        <w:rPr>
+          <w:b/>
+          <w:highlight w:val="yellow"/>
+        </w:rPr>
+        <w:t>Ajustar o</w:t>
+      </w:r>
+      <w:r>
+        <w:rPr>
+          <w:b/>
+          <w:highlight w:val="yellow"/>
+        </w:rPr>
+        <w:t xml:space="preserve"> bug</w:t>
+      </w:r>
+      <w:r>
+        <w:rPr>
+          <w:b/>
+          <w:highlight w:val="yellow"/>
+        </w:rPr>
+        <w:t xml:space="preserve"> de leitura de</w:t>
+      </w:r>
+      <w:r>
+        <w:rPr>
+          <w:b/>
+          <w:highlight w:val="yellow"/>
+        </w:rPr>
+        <w:t xml:space="preserve"> planilha</w:t>
+      </w:r>
+      <w:r>
+        <w:rPr>
+          <w:b/>
+          <w:highlight w:val="yellow"/>
+        </w:rPr>
+        <w:t>s</w:t>
+      </w:r>
+      <w:r>
+        <w:rPr>
+          <w:b/>
+          <w:highlight w:val="yellow"/>
+        </w:rPr>
+        <w:t xml:space="preserve"> que só fu</w:t>
+      </w:r>
+      <w:r>
+        <w:rPr>
+          <w:b/>
+          <w:highlight w:val="yellow"/>
+        </w:rPr>
+        <w:t>nciona com um modelo específico</w:t>
+      </w:r>
+    </w:p>
+    <w:p>
+      <w:pPr>
+        <w:rPr>
+          <w:b/>
+        </w:rPr>
+      </w:pPr>
+      <w:r>
+        <w:rPr>
+          <w:b/>
+        </w:rPr>
         <w:t xml:space="preserve">- </w:t>
       </w:r>
       <w:r>
@@ -41,517 +533,148 @@
           <w:b/>
           <w:highlight w:val="cyan"/>
         </w:rPr>
-        <w:t>Reordenar questões do simulados</w:t>
-      </w:r>
-    </w:p>
-    <w:p>
-      <w:r>
-        <w:tab/>
-        <w:t xml:space="preserve">- </w:t>
-      </w:r>
-      <w:proofErr w:type="spellStart"/>
+        <w:t>Corrigir</w:t>
+      </w:r>
+      <w:r>
+        <w:rPr>
+          <w:b/>
+          <w:highlight w:val="cyan"/>
+        </w:rPr>
+        <w:t xml:space="preserve"> </w:t>
+      </w:r>
+      <w:r>
+        <w:rPr>
+          <w:b/>
+          <w:highlight w:val="cyan"/>
+        </w:rPr>
+        <w:t xml:space="preserve">case </w:t>
+      </w:r>
+      <w:proofErr w:type="spellStart"/>
+      <w:r>
+        <w:rPr>
+          <w:b/>
+          <w:highlight w:val="cyan"/>
+        </w:rPr>
+        <w:t>sensitive</w:t>
+      </w:r>
+      <w:proofErr w:type="spellEnd"/>
+      <w:r>
+        <w:rPr>
+          <w:b/>
+          <w:highlight w:val="cyan"/>
+        </w:rPr>
+        <w:t xml:space="preserve"> e formatação de alguns campos.</w:t>
+      </w:r>
+    </w:p>
+    <w:p>
+      <w:pPr>
+        <w:rPr>
+          <w:b/>
+        </w:rPr>
+      </w:pPr>
+      <w:r>
+        <w:rPr>
+          <w:b/>
+        </w:rPr>
+        <w:t xml:space="preserve">- </w:t>
+      </w:r>
+      <w:r>
+        <w:rPr>
+          <w:b/>
+          <w:highlight w:val="red"/>
+        </w:rPr>
+        <w:t xml:space="preserve">Verificar relação de </w:t>
+      </w:r>
+      <w:proofErr w:type="spellStart"/>
+      <w:r>
+        <w:rPr>
+          <w:b/>
+          <w:highlight w:val="red"/>
+        </w:rPr>
+        <w:t>email</w:t>
+      </w:r>
+      <w:proofErr w:type="spellEnd"/>
+      <w:r>
+        <w:rPr>
+          <w:b/>
+          <w:highlight w:val="red"/>
+        </w:rPr>
+        <w:t xml:space="preserve"> e atualização de </w:t>
+      </w:r>
+      <w:proofErr w:type="spellStart"/>
+      <w:r>
+        <w:rPr>
+          <w:b/>
+          <w:highlight w:val="red"/>
+        </w:rPr>
+        <w:t>email</w:t>
+      </w:r>
+      <w:proofErr w:type="spellEnd"/>
+      <w:r>
+        <w:rPr>
+          <w:b/>
+        </w:rPr>
+        <w:t xml:space="preserve"> (5)</w:t>
+      </w:r>
+      <w:r>
+        <w:rPr>
+          <w:b/>
+        </w:rPr>
+        <w:t>:</w:t>
+      </w:r>
+    </w:p>
+    <w:p>
+      <w:pPr>
+        <w:ind w:firstLine="708"/>
+        <w:rPr>
+          <w:b/>
+        </w:rPr>
+      </w:pPr>
+      <w:r>
+        <w:rPr>
+          <w:b/>
+        </w:rPr>
+        <w:t xml:space="preserve">- </w:t>
+      </w:r>
       <w:proofErr w:type="gramStart"/>
       <w:r>
-        <w:t>frontend</w:t>
-      </w:r>
-      <w:proofErr w:type="spellEnd"/>
+        <w:rPr>
+          <w:b/>
+        </w:rPr>
+        <w:t>recupera</w:t>
+      </w:r>
       <w:proofErr w:type="gramEnd"/>
       <w:r>
-        <w:t xml:space="preserve">: usar a estratégia de ir criando no front e só mandar para o </w:t>
-      </w:r>
-      <w:proofErr w:type="spellStart"/>
-      <w:r>
-        <w:t>backend</w:t>
-      </w:r>
-      <w:proofErr w:type="spellEnd"/>
-      <w:r>
-        <w:t xml:space="preserve"> depois de finalizar (usar biblioteca de </w:t>
-      </w:r>
-      <w:proofErr w:type="spellStart"/>
-      <w:r>
-        <w:t>drag</w:t>
-      </w:r>
-      <w:proofErr w:type="spellEnd"/>
-      <w:r>
-        <w:t xml:space="preserve"> </w:t>
-      </w:r>
-      <w:proofErr w:type="spellStart"/>
-      <w:r>
-        <w:t>and</w:t>
-      </w:r>
-      <w:proofErr w:type="spellEnd"/>
-      <w:r>
-        <w:t xml:space="preserve"> </w:t>
-      </w:r>
-      <w:proofErr w:type="spellStart"/>
-      <w:r>
-        <w:t>drop</w:t>
-      </w:r>
-      <w:proofErr w:type="spellEnd"/>
-      <w:r>
-        <w:t xml:space="preserve"> para reorganizar as questões no simulado)</w:t>
-      </w:r>
-      <w:r>
-        <w:t>.</w:t>
-      </w:r>
-    </w:p>
-    <w:p>
-      <w:r>
-        <w:tab/>
-        <w:t xml:space="preserve">- </w:t>
-      </w:r>
-      <w:proofErr w:type="spellStart"/>
+        <w:rPr>
+          <w:b/>
+        </w:rPr>
+        <w:t xml:space="preserve"> as informações anteriores.</w:t>
+      </w:r>
+    </w:p>
+    <w:p>
+      <w:pPr>
+        <w:ind w:firstLine="708"/>
+      </w:pPr>
+      <w:r>
+        <w:rPr>
+          <w:b/>
+        </w:rPr>
+        <w:t xml:space="preserve">- </w:t>
+      </w:r>
       <w:proofErr w:type="gramStart"/>
       <w:r>
-        <w:t>backend</w:t>
-      </w:r>
-      <w:proofErr w:type="spellEnd"/>
+        <w:rPr>
+          <w:b/>
+        </w:rPr>
+        <w:t>envio</w:t>
+      </w:r>
       <w:proofErr w:type="gramEnd"/>
       <w:r>
-        <w:t xml:space="preserve">: </w:t>
-      </w:r>
-      <w:proofErr w:type="spellStart"/>
-      <w:r>
-        <w:t>refatorar</w:t>
-      </w:r>
-      <w:proofErr w:type="spellEnd"/>
-      <w:r>
-        <w:t xml:space="preserve"> a rota para receber a entidade completa ou a lista ordenada de ids das questões.</w:t>
-      </w:r>
-    </w:p>
-    <w:p>
-      <w:pPr>
-        <w:rPr>
-          <w:b/>
-          <w:highlight w:val="lightGray"/>
-        </w:rPr>
-      </w:pPr>
-      <w:r>
-        <w:rPr>
-          <w:highlight w:val="lightGray"/>
-        </w:rPr>
-        <w:t xml:space="preserve">- </w:t>
-      </w:r>
-      <w:r>
-        <w:rPr>
-          <w:b/>
-          <w:highlight w:val="lightGray"/>
-        </w:rPr>
-        <w:t>Duplicar simulado</w:t>
-      </w:r>
-    </w:p>
-    <w:p>
-      <w:pPr>
-        <w:rPr>
-          <w:highlight w:val="lightGray"/>
-        </w:rPr>
-      </w:pPr>
-      <w:r>
-        <w:rPr>
-          <w:b/>
-          <w:highlight w:val="lightGray"/>
-        </w:rPr>
-        <w:tab/>
-      </w:r>
-      <w:r>
-        <w:rPr>
-          <w:highlight w:val="lightGray"/>
-        </w:rPr>
-        <w:t xml:space="preserve">- </w:t>
-      </w:r>
-      <w:proofErr w:type="spellStart"/>
-      <w:proofErr w:type="gramStart"/>
-      <w:r>
-        <w:rPr>
-          <w:highlight w:val="lightGray"/>
-        </w:rPr>
-        <w:t>frontend</w:t>
-      </w:r>
-      <w:proofErr w:type="spellEnd"/>
-      <w:proofErr w:type="gramEnd"/>
-      <w:r>
-        <w:rPr>
-          <w:highlight w:val="lightGray"/>
-        </w:rPr>
-        <w:t>: implementar o ícone para esse funcionalidade.</w:t>
-      </w:r>
-    </w:p>
-    <w:p>
-      <w:r>
-        <w:rPr>
-          <w:b/>
-          <w:highlight w:val="lightGray"/>
-        </w:rPr>
-        <w:tab/>
-        <w:t xml:space="preserve">- </w:t>
-      </w:r>
-      <w:proofErr w:type="spellStart"/>
-      <w:proofErr w:type="gramStart"/>
-      <w:r>
-        <w:rPr>
-          <w:highlight w:val="lightGray"/>
-        </w:rPr>
-        <w:t>backend</w:t>
-      </w:r>
-      <w:proofErr w:type="spellEnd"/>
-      <w:proofErr w:type="gramEnd"/>
-      <w:r>
-        <w:rPr>
-          <w:highlight w:val="lightGray"/>
-        </w:rPr>
-        <w:t xml:space="preserve">: criar </w:t>
-      </w:r>
-      <w:proofErr w:type="spellStart"/>
-      <w:r>
-        <w:rPr>
-          <w:highlight w:val="lightGray"/>
-        </w:rPr>
-        <w:t>endpoint</w:t>
-      </w:r>
-      <w:proofErr w:type="spellEnd"/>
-      <w:r>
-        <w:rPr>
-          <w:highlight w:val="lightGray"/>
-        </w:rPr>
-        <w:t xml:space="preserve"> dedicado para duplicar simulado.</w:t>
-      </w:r>
-    </w:p>
-    <w:p/>
-    <w:p>
-      <w:r>
-        <w:t>CADASTRO DE ALUNOS</w:t>
-      </w:r>
-    </w:p>
-    <w:p>
-      <w:pPr>
-        <w:rPr>
-          <w:b/>
-        </w:rPr>
-      </w:pPr>
-      <w:r>
-        <w:t xml:space="preserve">- </w:t>
-      </w:r>
-      <w:r>
-        <w:rPr>
-          <w:b/>
-          <w:highlight w:val="yellow"/>
-        </w:rPr>
-        <w:t xml:space="preserve">Fazer importação em massa a partir de tabela do </w:t>
-      </w:r>
-      <w:proofErr w:type="spellStart"/>
-      <w:r>
-        <w:rPr>
-          <w:b/>
-          <w:highlight w:val="yellow"/>
-        </w:rPr>
-        <w:t>excel</w:t>
-      </w:r>
-      <w:proofErr w:type="spellEnd"/>
-    </w:p>
-    <w:p>
-      <w:r>
-        <w:rPr>
-          <w:b/>
-        </w:rPr>
-        <w:tab/>
-        <w:t xml:space="preserve">- </w:t>
-      </w:r>
-      <w:proofErr w:type="spellStart"/>
-      <w:proofErr w:type="gramStart"/>
-      <w:r>
-        <w:t>frontend</w:t>
-      </w:r>
-      <w:proofErr w:type="spellEnd"/>
-      <w:proofErr w:type="gramEnd"/>
-      <w:r>
-        <w:t xml:space="preserve">: </w:t>
-      </w:r>
-      <w:proofErr w:type="spellStart"/>
-      <w:r>
-        <w:t>refatorar</w:t>
-      </w:r>
-      <w:proofErr w:type="spellEnd"/>
-      <w:r>
-        <w:t xml:space="preserve"> a página de cadastro de criação.</w:t>
-      </w:r>
-    </w:p>
-    <w:p>
-      <w:r>
-        <w:tab/>
-        <w:t xml:space="preserve">- </w:t>
-      </w:r>
-      <w:proofErr w:type="spellStart"/>
-      <w:proofErr w:type="gramStart"/>
-      <w:r>
-        <w:t>backend</w:t>
-      </w:r>
-      <w:proofErr w:type="spellEnd"/>
-      <w:proofErr w:type="gramEnd"/>
-      <w:r>
-        <w:t>: criar uma rota dedicada para criação de cadastro de alunos em massa.</w:t>
-      </w:r>
-    </w:p>
-    <w:p/>
-    <w:p>
-      <w:r>
-        <w:t xml:space="preserve">CADASTRO DE QUESTÕES </w:t>
-      </w:r>
-    </w:p>
-    <w:p>
-      <w:r>
-        <w:t xml:space="preserve">- </w:t>
-      </w:r>
-      <w:proofErr w:type="spellStart"/>
-      <w:r>
-        <w:rPr>
-          <w:b/>
-          <w:highlight w:val="red"/>
-        </w:rPr>
-        <w:t>Refatoração</w:t>
-      </w:r>
-      <w:proofErr w:type="spellEnd"/>
-      <w:r>
-        <w:rPr>
-          <w:b/>
-          <w:highlight w:val="red"/>
-        </w:rPr>
-        <w:t xml:space="preserve"> do layout da página de cadastro de questões:</w:t>
-      </w:r>
-      <w:r>
-        <w:rPr>
-          <w:b/>
-        </w:rPr>
-        <w:t xml:space="preserve"> (1)</w:t>
-      </w:r>
-    </w:p>
-    <w:p>
-      <w:pPr>
-        <w:ind w:firstLine="708"/>
-      </w:pPr>
-      <w:r>
-        <w:t>- Remover campo de descrição de alternativas</w:t>
-      </w:r>
-      <w:r>
-        <w:t>.</w:t>
-      </w:r>
-    </w:p>
-    <w:p>
-      <w:pPr>
-        <w:ind w:firstLine="708"/>
-      </w:pPr>
-      <w:r>
-        <w:t>- Colocar gabar</w:t>
-      </w:r>
-      <w:r>
-        <w:t>ito como campo único de seleção.</w:t>
-      </w:r>
-    </w:p>
-    <w:p>
-      <w:pPr>
-        <w:ind w:firstLine="708"/>
-      </w:pPr>
-      <w:r>
-        <w:t>- Inserir campo de</w:t>
-      </w:r>
-      <w:r>
-        <w:t xml:space="preserve"> assunto no cadastro da questão (inserir o </w:t>
-      </w:r>
-      <w:r>
-        <w:rPr>
-          <w:u w:val="single"/>
-        </w:rPr>
-        <w:t>vínculo</w:t>
-      </w:r>
-      <w:r>
-        <w:t xml:space="preserve"> no momento do cadastro).</w:t>
-      </w:r>
-    </w:p>
-    <w:p>
-      <w:pPr>
-        <w:ind w:firstLine="708"/>
-      </w:pPr>
-      <w:r>
-        <w:t xml:space="preserve">- Aumentar tamanho do </w:t>
-      </w:r>
-      <w:proofErr w:type="spellStart"/>
-      <w:r>
-        <w:t>preview</w:t>
-      </w:r>
-      <w:proofErr w:type="spellEnd"/>
-      <w:r>
-        <w:t xml:space="preserve"> das questões adaptadas</w:t>
-      </w:r>
-      <w:r>
-        <w:t>.</w:t>
-      </w:r>
-    </w:p>
-    <w:p/>
-    <w:p>
-      <w:r>
-        <w:t>ADICIONAR DIAGNÓSTICOS</w:t>
-      </w:r>
-    </w:p>
-    <w:p>
-      <w:pPr>
-        <w:rPr>
-          <w:b/>
-        </w:rPr>
-      </w:pPr>
-      <w:r>
-        <w:t xml:space="preserve">- </w:t>
-      </w:r>
-      <w:r>
-        <w:rPr>
-          <w:b/>
-          <w:highlight w:val="yellow"/>
-        </w:rPr>
-        <w:t>Ajustar o</w:t>
-      </w:r>
-      <w:r>
-        <w:rPr>
-          <w:b/>
-          <w:highlight w:val="yellow"/>
-        </w:rPr>
-        <w:t xml:space="preserve"> bug</w:t>
-      </w:r>
-      <w:r>
-        <w:rPr>
-          <w:b/>
-          <w:highlight w:val="yellow"/>
-        </w:rPr>
-        <w:t xml:space="preserve"> de leitura de</w:t>
-      </w:r>
-      <w:r>
-        <w:rPr>
-          <w:b/>
-          <w:highlight w:val="yellow"/>
-        </w:rPr>
-        <w:t xml:space="preserve"> planilha</w:t>
-      </w:r>
-      <w:r>
-        <w:rPr>
-          <w:b/>
-          <w:highlight w:val="yellow"/>
-        </w:rPr>
-        <w:t>s</w:t>
-      </w:r>
-      <w:r>
-        <w:rPr>
-          <w:b/>
-          <w:highlight w:val="yellow"/>
-        </w:rPr>
-        <w:t xml:space="preserve"> que só fu</w:t>
-      </w:r>
-      <w:r>
-        <w:rPr>
-          <w:b/>
-          <w:highlight w:val="yellow"/>
-        </w:rPr>
-        <w:t>nciona com um modelo específico</w:t>
-      </w:r>
-    </w:p>
-    <w:p>
-      <w:pPr>
-        <w:rPr>
-          <w:b/>
-        </w:rPr>
-      </w:pPr>
-      <w:r>
-        <w:rPr>
-          <w:b/>
-        </w:rPr>
-        <w:t xml:space="preserve">- </w:t>
-      </w:r>
-      <w:r>
-        <w:rPr>
-          <w:b/>
-          <w:highlight w:val="cyan"/>
-        </w:rPr>
-        <w:t>Corrigir</w:t>
-      </w:r>
-      <w:r>
-        <w:rPr>
-          <w:b/>
-          <w:highlight w:val="cyan"/>
-        </w:rPr>
-        <w:t xml:space="preserve"> </w:t>
-      </w:r>
-      <w:r>
-        <w:rPr>
-          <w:b/>
-          <w:highlight w:val="cyan"/>
-        </w:rPr>
-        <w:t xml:space="preserve">case </w:t>
-      </w:r>
-      <w:proofErr w:type="spellStart"/>
-      <w:r>
-        <w:rPr>
-          <w:b/>
-          <w:highlight w:val="cyan"/>
-        </w:rPr>
-        <w:t>sensitive</w:t>
-      </w:r>
-      <w:proofErr w:type="spellEnd"/>
-      <w:r>
-        <w:rPr>
-          <w:b/>
-          <w:highlight w:val="cyan"/>
-        </w:rPr>
-        <w:t xml:space="preserve"> e formatação de alguns campos.</w:t>
-      </w:r>
-    </w:p>
-    <w:p>
-      <w:pPr>
-        <w:rPr>
-          <w:b/>
-        </w:rPr>
-      </w:pPr>
-      <w:r>
-        <w:rPr>
-          <w:b/>
-        </w:rPr>
-        <w:t xml:space="preserve">- </w:t>
-      </w:r>
-      <w:r>
-        <w:rPr>
-          <w:b/>
-          <w:highlight w:val="red"/>
-        </w:rPr>
-        <w:t xml:space="preserve">Verificar relação de </w:t>
-      </w:r>
-      <w:proofErr w:type="spellStart"/>
-      <w:r>
-        <w:rPr>
-          <w:b/>
-          <w:highlight w:val="red"/>
-        </w:rPr>
-        <w:t>email</w:t>
-      </w:r>
-      <w:proofErr w:type="spellEnd"/>
-      <w:r>
-        <w:rPr>
-          <w:b/>
-          <w:highlight w:val="red"/>
-        </w:rPr>
-        <w:t xml:space="preserve"> e atualização de </w:t>
-      </w:r>
-      <w:proofErr w:type="spellStart"/>
-      <w:r>
-        <w:rPr>
-          <w:b/>
-          <w:highlight w:val="red"/>
-        </w:rPr>
-        <w:t>email</w:t>
-      </w:r>
-      <w:proofErr w:type="spellEnd"/>
-      <w:r>
-        <w:rPr>
-          <w:b/>
-        </w:rPr>
-        <w:t xml:space="preserve"> (5)</w:t>
-      </w:r>
-    </w:p>
-    <w:p>
+        <w:rPr>
+          <w:b/>
+        </w:rPr>
+        <w:t xml:space="preserve"> do relatório via aplicação.</w:t>
+      </w:r>
       <w:r>
         <w:br w:type="page"/>
       </w:r>
@@ -841,118 +964,117 @@
         <w:t>Criar um filtro Dinâmico para a página de listagem</w:t>
       </w:r>
     </w:p>
+    <w:p/>
+    <w:p>
+      <w:r>
+        <w:t>LOGIN DA APLICAÇÃO:</w:t>
+      </w:r>
+    </w:p>
+    <w:p>
+      <w:pPr>
+        <w:rPr>
+          <w:highlight w:val="green"/>
+        </w:rPr>
+      </w:pPr>
+      <w:r>
+        <w:t xml:space="preserve">- </w:t>
+      </w:r>
+      <w:r>
+        <w:rPr>
+          <w:b/>
+          <w:highlight w:val="green"/>
+        </w:rPr>
+        <w:t>Usar SSO do Google para logar.</w:t>
+      </w:r>
+    </w:p>
+    <w:p>
+      <w:pPr>
+        <w:rPr>
+          <w:b/>
+        </w:rPr>
+      </w:pPr>
+      <w:r>
+        <w:t xml:space="preserve">- </w:t>
+      </w:r>
+      <w:r>
+        <w:rPr>
+          <w:b/>
+          <w:highlight w:val="green"/>
+        </w:rPr>
+        <w:t xml:space="preserve">Definir como cadastrar um aluno (responsabilidade dele ou de quem cadastra como </w:t>
+      </w:r>
+      <w:proofErr w:type="spellStart"/>
+      <w:r>
+        <w:rPr>
+          <w:b/>
+          <w:highlight w:val="green"/>
+        </w:rPr>
+        <w:t>adm</w:t>
+      </w:r>
+      <w:proofErr w:type="spellEnd"/>
+      <w:r>
+        <w:rPr>
+          <w:b/>
+          <w:highlight w:val="green"/>
+        </w:rPr>
+        <w:t>?)</w:t>
+      </w:r>
+    </w:p>
+    <w:p>
+      <w:pPr>
+        <w:rPr>
+          <w:b/>
+        </w:rPr>
+      </w:pPr>
+      <w:r>
+        <w:rPr>
+          <w:b/>
+        </w:rPr>
+        <w:t xml:space="preserve">- </w:t>
+      </w:r>
+      <w:r>
+        <w:rPr>
+          <w:b/>
+          <w:highlight w:val="green"/>
+        </w:rPr>
+        <w:t>Definir as autorizações e autenticação dos perfis de usuário.</w:t>
+      </w:r>
+    </w:p>
+    <w:p>
+      <w:pPr>
+        <w:rPr>
+          <w:b/>
+        </w:rPr>
+      </w:pPr>
+    </w:p>
     <w:p>
       <w:bookmarkStart w:id="0" w:name="_GoBack"/>
+      <w:r>
+        <w:t>DASHBOARD</w:t>
+      </w:r>
+    </w:p>
+    <w:p>
+      <w:r>
+        <w:t xml:space="preserve">- </w:t>
+      </w:r>
+      <w:proofErr w:type="gramStart"/>
+      <w:r>
+        <w:t>individual</w:t>
+      </w:r>
+      <w:proofErr w:type="gramEnd"/>
+      <w:r>
+        <w:t xml:space="preserve"> aluno</w:t>
+      </w:r>
+    </w:p>
+    <w:p>
+      <w:r>
+        <w:t xml:space="preserve">- </w:t>
+      </w:r>
+      <w:proofErr w:type="gramStart"/>
+      <w:r>
+        <w:t>simulado</w:t>
+      </w:r>
       <w:bookmarkEnd w:id="0"/>
-    </w:p>
-    <w:p>
-      <w:r>
-        <w:t>LOGIN DA APLICAÇÃO:</w:t>
-      </w:r>
-    </w:p>
-    <w:p>
-      <w:pPr>
-        <w:rPr>
-          <w:highlight w:val="green"/>
-        </w:rPr>
-      </w:pPr>
-      <w:r>
-        <w:t xml:space="preserve">- </w:t>
-      </w:r>
-      <w:r>
-        <w:rPr>
-          <w:b/>
-          <w:highlight w:val="green"/>
-        </w:rPr>
-        <w:t>Usar SSO do Google para logar.</w:t>
-      </w:r>
-    </w:p>
-    <w:p>
-      <w:pPr>
-        <w:rPr>
-          <w:b/>
-        </w:rPr>
-      </w:pPr>
-      <w:r>
-        <w:t xml:space="preserve">- </w:t>
-      </w:r>
-      <w:r>
-        <w:rPr>
-          <w:b/>
-          <w:highlight w:val="green"/>
-        </w:rPr>
-        <w:t xml:space="preserve">Definir como cadastrar um aluno (responsabilidade dele ou de quem cadastra como </w:t>
-      </w:r>
-      <w:proofErr w:type="spellStart"/>
-      <w:r>
-        <w:rPr>
-          <w:b/>
-          <w:highlight w:val="green"/>
-        </w:rPr>
-        <w:t>adm</w:t>
-      </w:r>
-      <w:proofErr w:type="spellEnd"/>
-      <w:r>
-        <w:rPr>
-          <w:b/>
-          <w:highlight w:val="green"/>
-        </w:rPr>
-        <w:t>?)</w:t>
-      </w:r>
-    </w:p>
-    <w:p>
-      <w:pPr>
-        <w:rPr>
-          <w:b/>
-        </w:rPr>
-      </w:pPr>
-      <w:r>
-        <w:rPr>
-          <w:b/>
-        </w:rPr>
-        <w:t xml:space="preserve">- </w:t>
-      </w:r>
-      <w:r>
-        <w:rPr>
-          <w:b/>
-          <w:highlight w:val="green"/>
-        </w:rPr>
-        <w:t>Definir as autorizações e autenticação dos perfis de usuário.</w:t>
-      </w:r>
-    </w:p>
-    <w:p>
-      <w:pPr>
-        <w:rPr>
-          <w:b/>
-        </w:rPr>
-      </w:pPr>
-    </w:p>
-    <w:p>
-      <w:r>
-        <w:t>DASHBOARD</w:t>
-      </w:r>
-    </w:p>
-    <w:p>
-      <w:r>
-        <w:t xml:space="preserve">- </w:t>
-      </w:r>
-      <w:proofErr w:type="gramStart"/>
-      <w:r>
-        <w:t>individual</w:t>
-      </w:r>
-      <w:proofErr w:type="gramEnd"/>
-      <w:r>
-        <w:t xml:space="preserve"> aluno</w:t>
-      </w:r>
-    </w:p>
-    <w:p>
-      <w:r>
-        <w:t xml:space="preserve">- </w:t>
-      </w:r>
-      <w:proofErr w:type="gramStart"/>
-      <w:r>
-        <w:t>simulado</w:t>
-      </w:r>
       <w:proofErr w:type="gramEnd"/>
     </w:p>
     <w:sectPr>

</xml_diff>

<commit_message>
feat: implementa funcionalidade de download em massa e refatora componentes de formulário e DragAndDrop de arquivos
</commit_message>
<xml_diff>
--- a/melhorias_docs/Report-generator melhorias v2.docx
+++ b/melhorias_docs/Report-generator melhorias v2.docx
@@ -359,231 +359,307 @@
     </w:p>
     <w:p/>
     <w:p>
-      <w:r>
+      <w:pPr>
+        <w:rPr>
+          <w:highlight w:val="lightGray"/>
+        </w:rPr>
+      </w:pPr>
+      <w:r>
+        <w:rPr>
+          <w:highlight w:val="lightGray"/>
+        </w:rPr>
         <w:t xml:space="preserve">CADASTRO DE QUESTÕES </w:t>
       </w:r>
     </w:p>
     <w:p>
-      <w:r>
-        <w:t xml:space="preserve">- </w:t>
-      </w:r>
-      <w:proofErr w:type="spellStart"/>
+      <w:pPr>
+        <w:rPr>
+          <w:highlight w:val="lightGray"/>
+        </w:rPr>
+      </w:pPr>
+      <w:r>
+        <w:rPr>
+          <w:highlight w:val="lightGray"/>
+        </w:rPr>
+        <w:t xml:space="preserve">- </w:t>
+      </w:r>
+      <w:proofErr w:type="spellStart"/>
+      <w:r>
+        <w:rPr>
+          <w:b/>
+          <w:highlight w:val="lightGray"/>
+        </w:rPr>
+        <w:t>Refatoração</w:t>
+      </w:r>
+      <w:proofErr w:type="spellEnd"/>
+      <w:r>
+        <w:rPr>
+          <w:b/>
+          <w:highlight w:val="lightGray"/>
+        </w:rPr>
+        <w:t xml:space="preserve"> do layout da página de cadastro de questões:</w:t>
+      </w:r>
+      <w:r>
+        <w:rPr>
+          <w:b/>
+          <w:highlight w:val="lightGray"/>
+        </w:rPr>
+        <w:t xml:space="preserve"> (1)</w:t>
+      </w:r>
+    </w:p>
+    <w:p>
+      <w:pPr>
+        <w:ind w:firstLine="708"/>
+        <w:rPr>
+          <w:highlight w:val="lightGray"/>
+        </w:rPr>
+      </w:pPr>
+      <w:r>
+        <w:rPr>
+          <w:highlight w:val="lightGray"/>
+        </w:rPr>
+        <w:t>- Remover campo de descrição de alternativas</w:t>
+      </w:r>
+      <w:r>
+        <w:rPr>
+          <w:highlight w:val="lightGray"/>
+        </w:rPr>
+        <w:t>.</w:t>
+      </w:r>
+    </w:p>
+    <w:p>
+      <w:pPr>
+        <w:ind w:firstLine="708"/>
+        <w:rPr>
+          <w:highlight w:val="lightGray"/>
+        </w:rPr>
+      </w:pPr>
+      <w:r>
+        <w:rPr>
+          <w:highlight w:val="lightGray"/>
+        </w:rPr>
+        <w:t>- Colocar gabar</w:t>
+      </w:r>
+      <w:r>
+        <w:rPr>
+          <w:highlight w:val="lightGray"/>
+        </w:rPr>
+        <w:t>ito como campo único de seleção.</w:t>
+      </w:r>
+    </w:p>
+    <w:p>
+      <w:pPr>
+        <w:ind w:firstLine="708"/>
+        <w:rPr>
+          <w:highlight w:val="lightGray"/>
+        </w:rPr>
+      </w:pPr>
+      <w:r>
+        <w:rPr>
+          <w:highlight w:val="lightGray"/>
+        </w:rPr>
+        <w:t>- Inserir campo de</w:t>
+      </w:r>
+      <w:r>
+        <w:rPr>
+          <w:highlight w:val="lightGray"/>
+        </w:rPr>
+        <w:t xml:space="preserve"> assunto no cadastro da questão (inserir o </w:t>
+      </w:r>
+      <w:r>
+        <w:rPr>
+          <w:highlight w:val="lightGray"/>
+          <w:u w:val="single"/>
+        </w:rPr>
+        <w:t>vínculo</w:t>
+      </w:r>
+      <w:r>
+        <w:rPr>
+          <w:highlight w:val="lightGray"/>
+        </w:rPr>
+        <w:t xml:space="preserve"> no momento do cadastro).</w:t>
+      </w:r>
+    </w:p>
+    <w:p>
+      <w:pPr>
+        <w:ind w:firstLine="708"/>
+      </w:pPr>
+      <w:r>
+        <w:rPr>
+          <w:highlight w:val="lightGray"/>
+        </w:rPr>
+        <w:t xml:space="preserve">- Aumentar tamanho do </w:t>
+      </w:r>
+      <w:proofErr w:type="spellStart"/>
+      <w:r>
+        <w:rPr>
+          <w:highlight w:val="lightGray"/>
+        </w:rPr>
+        <w:t>preview</w:t>
+      </w:r>
+      <w:proofErr w:type="spellEnd"/>
+      <w:r>
+        <w:rPr>
+          <w:highlight w:val="lightGray"/>
+        </w:rPr>
+        <w:t xml:space="preserve"> das questões adaptadas</w:t>
+      </w:r>
+      <w:r>
+        <w:rPr>
+          <w:highlight w:val="lightGray"/>
+        </w:rPr>
+        <w:t>.</w:t>
+      </w:r>
+    </w:p>
+    <w:p/>
+    <w:p>
+      <w:r>
+        <w:t>ADICIONAR DIAGNÓSTICOS</w:t>
+      </w:r>
+    </w:p>
+    <w:p>
+      <w:pPr>
+        <w:rPr>
+          <w:b/>
+        </w:rPr>
+      </w:pPr>
+      <w:r>
+        <w:t xml:space="preserve">- </w:t>
+      </w:r>
+      <w:r>
+        <w:rPr>
+          <w:b/>
+          <w:highlight w:val="yellow"/>
+        </w:rPr>
+        <w:t>Ajustar o</w:t>
+      </w:r>
+      <w:r>
+        <w:rPr>
+          <w:b/>
+          <w:highlight w:val="yellow"/>
+        </w:rPr>
+        <w:t xml:space="preserve"> bug</w:t>
+      </w:r>
+      <w:r>
+        <w:rPr>
+          <w:b/>
+          <w:highlight w:val="yellow"/>
+        </w:rPr>
+        <w:t xml:space="preserve"> de leitura de</w:t>
+      </w:r>
+      <w:r>
+        <w:rPr>
+          <w:b/>
+          <w:highlight w:val="yellow"/>
+        </w:rPr>
+        <w:t xml:space="preserve"> planilha</w:t>
+      </w:r>
+      <w:r>
+        <w:rPr>
+          <w:b/>
+          <w:highlight w:val="yellow"/>
+        </w:rPr>
+        <w:t>s</w:t>
+      </w:r>
+      <w:r>
+        <w:rPr>
+          <w:b/>
+          <w:highlight w:val="yellow"/>
+        </w:rPr>
+        <w:t xml:space="preserve"> que só fu</w:t>
+      </w:r>
+      <w:r>
+        <w:rPr>
+          <w:b/>
+          <w:highlight w:val="yellow"/>
+        </w:rPr>
+        <w:t>nciona com um modelo específico</w:t>
+      </w:r>
+    </w:p>
+    <w:p>
+      <w:pPr>
+        <w:rPr>
+          <w:b/>
+        </w:rPr>
+      </w:pPr>
+      <w:r>
+        <w:rPr>
+          <w:b/>
+        </w:rPr>
+        <w:t xml:space="preserve">- </w:t>
+      </w:r>
+      <w:r>
+        <w:rPr>
+          <w:b/>
+          <w:highlight w:val="lightGray"/>
+        </w:rPr>
+        <w:t>Corrigir</w:t>
+      </w:r>
+      <w:r>
+        <w:rPr>
+          <w:b/>
+          <w:highlight w:val="lightGray"/>
+        </w:rPr>
+        <w:t xml:space="preserve"> </w:t>
+      </w:r>
+      <w:r>
+        <w:rPr>
+          <w:b/>
+          <w:highlight w:val="lightGray"/>
+        </w:rPr>
+        <w:t xml:space="preserve">case </w:t>
+      </w:r>
+      <w:proofErr w:type="spellStart"/>
+      <w:r>
+        <w:rPr>
+          <w:b/>
+          <w:highlight w:val="lightGray"/>
+        </w:rPr>
+        <w:t>sensitive</w:t>
+      </w:r>
+      <w:proofErr w:type="spellEnd"/>
+      <w:r>
+        <w:rPr>
+          <w:b/>
+          <w:highlight w:val="lightGray"/>
+        </w:rPr>
+        <w:t xml:space="preserve"> e formatação de alguns campos.</w:t>
+      </w:r>
+    </w:p>
+    <w:p>
+      <w:pPr>
+        <w:rPr>
+          <w:b/>
+        </w:rPr>
+      </w:pPr>
+      <w:r>
+        <w:rPr>
+          <w:b/>
+        </w:rPr>
+        <w:t xml:space="preserve">- </w:t>
+      </w:r>
       <w:r>
         <w:rPr>
           <w:b/>
           <w:highlight w:val="red"/>
         </w:rPr>
-        <w:t>Refatoração</w:t>
-      </w:r>
-      <w:proofErr w:type="spellEnd"/>
+        <w:t xml:space="preserve">Verificar relação de </w:t>
+      </w:r>
+      <w:proofErr w:type="spellStart"/>
       <w:r>
         <w:rPr>
           <w:b/>
           <w:highlight w:val="red"/>
         </w:rPr>
-        <w:t xml:space="preserve"> do layout da página de cadastro de questões:</w:t>
-      </w:r>
-      <w:r>
-        <w:rPr>
-          <w:b/>
-        </w:rPr>
-        <w:t xml:space="preserve"> (1)</w:t>
-      </w:r>
-    </w:p>
-    <w:p>
-      <w:pPr>
-        <w:ind w:firstLine="708"/>
-      </w:pPr>
-      <w:r>
-        <w:t>- Remover campo de descrição de alternativas</w:t>
-      </w:r>
-      <w:r>
-        <w:t>.</w:t>
-      </w:r>
-    </w:p>
-    <w:p>
-      <w:pPr>
-        <w:ind w:firstLine="708"/>
-      </w:pPr>
-      <w:r>
-        <w:t>- Colocar gabar</w:t>
-      </w:r>
-      <w:r>
-        <w:t>ito como campo único de seleção.</w:t>
-      </w:r>
-    </w:p>
-    <w:p>
-      <w:pPr>
-        <w:ind w:firstLine="708"/>
-      </w:pPr>
-      <w:r>
-        <w:t>- Inserir campo de</w:t>
-      </w:r>
-      <w:r>
-        <w:t xml:space="preserve"> assunto no cadastro da questão (inserir o </w:t>
-      </w:r>
-      <w:r>
-        <w:rPr>
-          <w:u w:val="single"/>
-        </w:rPr>
-        <w:t>vínculo</w:t>
-      </w:r>
-      <w:r>
-        <w:t xml:space="preserve"> no momento do cadastro).</w:t>
-      </w:r>
-    </w:p>
-    <w:p>
-      <w:pPr>
-        <w:ind w:firstLine="708"/>
-      </w:pPr>
-      <w:r>
-        <w:t xml:space="preserve">- Aumentar tamanho do </w:t>
-      </w:r>
-      <w:proofErr w:type="spellStart"/>
-      <w:r>
-        <w:t>preview</w:t>
-      </w:r>
-      <w:proofErr w:type="spellEnd"/>
-      <w:r>
-        <w:t xml:space="preserve"> das questões adaptadas</w:t>
-      </w:r>
-      <w:r>
-        <w:t>.</w:t>
-      </w:r>
-    </w:p>
-    <w:p/>
-    <w:p>
-      <w:r>
-        <w:t>ADICIONAR DIAGNÓSTICOS</w:t>
-      </w:r>
-    </w:p>
-    <w:p>
-      <w:pPr>
-        <w:rPr>
-          <w:b/>
-        </w:rPr>
-      </w:pPr>
-      <w:r>
-        <w:t xml:space="preserve">- </w:t>
-      </w:r>
-      <w:r>
-        <w:rPr>
-          <w:b/>
-          <w:highlight w:val="yellow"/>
-        </w:rPr>
-        <w:t>Ajustar o</w:t>
-      </w:r>
-      <w:r>
-        <w:rPr>
-          <w:b/>
-          <w:highlight w:val="yellow"/>
-        </w:rPr>
-        <w:t xml:space="preserve"> bug</w:t>
-      </w:r>
-      <w:r>
-        <w:rPr>
-          <w:b/>
-          <w:highlight w:val="yellow"/>
-        </w:rPr>
-        <w:t xml:space="preserve"> de leitura de</w:t>
-      </w:r>
-      <w:r>
-        <w:rPr>
-          <w:b/>
-          <w:highlight w:val="yellow"/>
-        </w:rPr>
-        <w:t xml:space="preserve"> planilha</w:t>
-      </w:r>
-      <w:r>
-        <w:rPr>
-          <w:b/>
-          <w:highlight w:val="yellow"/>
-        </w:rPr>
-        <w:t>s</w:t>
-      </w:r>
-      <w:r>
-        <w:rPr>
-          <w:b/>
-          <w:highlight w:val="yellow"/>
-        </w:rPr>
-        <w:t xml:space="preserve"> que só fu</w:t>
-      </w:r>
-      <w:r>
-        <w:rPr>
-          <w:b/>
-          <w:highlight w:val="yellow"/>
-        </w:rPr>
-        <w:t>nciona com um modelo específico</w:t>
-      </w:r>
-    </w:p>
-    <w:p>
-      <w:pPr>
-        <w:rPr>
-          <w:b/>
-        </w:rPr>
-      </w:pPr>
-      <w:r>
-        <w:rPr>
-          <w:b/>
-        </w:rPr>
-        <w:t xml:space="preserve">- </w:t>
-      </w:r>
-      <w:r>
-        <w:rPr>
-          <w:b/>
-          <w:highlight w:val="cyan"/>
-        </w:rPr>
-        <w:t>Corrigir</w:t>
-      </w:r>
-      <w:r>
-        <w:rPr>
-          <w:b/>
-          <w:highlight w:val="cyan"/>
-        </w:rPr>
-        <w:t xml:space="preserve"> </w:t>
-      </w:r>
-      <w:r>
-        <w:rPr>
-          <w:b/>
-          <w:highlight w:val="cyan"/>
-        </w:rPr>
-        <w:t xml:space="preserve">case </w:t>
-      </w:r>
-      <w:proofErr w:type="spellStart"/>
-      <w:r>
-        <w:rPr>
-          <w:b/>
-          <w:highlight w:val="cyan"/>
-        </w:rPr>
-        <w:t>sensitive</w:t>
-      </w:r>
-      <w:proofErr w:type="spellEnd"/>
-      <w:r>
-        <w:rPr>
-          <w:b/>
-          <w:highlight w:val="cyan"/>
-        </w:rPr>
-        <w:t xml:space="preserve"> e formatação de alguns campos.</w:t>
-      </w:r>
-    </w:p>
-    <w:p>
-      <w:pPr>
-        <w:rPr>
-          <w:b/>
-        </w:rPr>
-      </w:pPr>
-      <w:r>
-        <w:rPr>
-          <w:b/>
-        </w:rPr>
-        <w:t xml:space="preserve">- </w:t>
-      </w:r>
+        <w:t>email</w:t>
+      </w:r>
+      <w:proofErr w:type="spellEnd"/>
       <w:r>
         <w:rPr>
           <w:b/>
           <w:highlight w:val="red"/>
         </w:rPr>
-        <w:t xml:space="preserve">Verificar relação de </w:t>
+        <w:t xml:space="preserve"> e atualização de </w:t>
       </w:r>
       <w:proofErr w:type="spellStart"/>
       <w:r>
@@ -597,22 +673,6 @@
       <w:r>
         <w:rPr>
           <w:b/>
-          <w:highlight w:val="red"/>
-        </w:rPr>
-        <w:t xml:space="preserve"> e atualização de </w:t>
-      </w:r>
-      <w:proofErr w:type="spellStart"/>
-      <w:r>
-        <w:rPr>
-          <w:b/>
-          <w:highlight w:val="red"/>
-        </w:rPr>
-        <w:t>email</w:t>
-      </w:r>
-      <w:proofErr w:type="spellEnd"/>
-      <w:r>
-        <w:rPr>
-          <w:b/>
         </w:rPr>
         <w:t xml:space="preserve"> (5)</w:t>
       </w:r>
@@ -622,6 +682,8 @@
         </w:rPr>
         <w:t>:</w:t>
       </w:r>
+      <w:bookmarkStart w:id="0" w:name="_GoBack"/>
+      <w:bookmarkEnd w:id="0"/>
     </w:p>
     <w:p>
       <w:pPr>
@@ -1048,7 +1110,6 @@
       </w:pPr>
     </w:p>
     <w:p>
-      <w:bookmarkStart w:id="0" w:name="_GoBack"/>
       <w:r>
         <w:t>DASHBOARD</w:t>
       </w:r>
@@ -1074,7 +1135,6 @@
       <w:r>
         <w:t>simulado</w:t>
       </w:r>
-      <w:bookmarkEnd w:id="0"/>
       <w:proofErr w:type="gramEnd"/>
     </w:p>
     <w:sectPr>

</xml_diff>

<commit_message>
refatora componente de drag and drop criando um wrapper e refatora uso do componente na aplicação
</commit_message>
<xml_diff>
--- a/melhorias_docs/Report-generator melhorias v2.docx
+++ b/melhorias_docs/Report-generator melhorias v2.docx
@@ -682,330 +682,355 @@
         </w:rPr>
         <w:t>:</w:t>
       </w:r>
+    </w:p>
+    <w:p>
+      <w:pPr>
+        <w:ind w:firstLine="708"/>
+        <w:rPr>
+          <w:b/>
+        </w:rPr>
+      </w:pPr>
+      <w:r>
+        <w:rPr>
+          <w:b/>
+        </w:rPr>
+        <w:t xml:space="preserve">- </w:t>
+      </w:r>
+      <w:proofErr w:type="gramStart"/>
+      <w:r>
+        <w:rPr>
+          <w:b/>
+        </w:rPr>
+        <w:t>recupera</w:t>
+      </w:r>
+      <w:proofErr w:type="gramEnd"/>
+      <w:r>
+        <w:rPr>
+          <w:b/>
+        </w:rPr>
+        <w:t xml:space="preserve"> as informações anteriores.</w:t>
+      </w:r>
+    </w:p>
+    <w:p>
+      <w:pPr>
+        <w:ind w:firstLine="708"/>
+      </w:pPr>
+      <w:r>
+        <w:rPr>
+          <w:b/>
+        </w:rPr>
+        <w:t xml:space="preserve">- </w:t>
+      </w:r>
+      <w:proofErr w:type="gramStart"/>
+      <w:r>
+        <w:rPr>
+          <w:b/>
+        </w:rPr>
+        <w:t>envio</w:t>
+      </w:r>
+      <w:proofErr w:type="gramEnd"/>
+      <w:r>
+        <w:rPr>
+          <w:b/>
+        </w:rPr>
+        <w:t xml:space="preserve"> do relatório via aplicação.</w:t>
+      </w:r>
+      <w:r>
+        <w:br w:type="page"/>
+      </w:r>
+    </w:p>
+    <w:p>
+      <w:r>
+        <w:lastRenderedPageBreak/>
+        <w:t>LISTA</w:t>
+      </w:r>
+      <w:r>
+        <w:t xml:space="preserve"> DE DIAGNÓSTICOS</w:t>
+      </w:r>
+    </w:p>
+    <w:p>
+      <w:pPr>
+        <w:rPr>
+          <w:b/>
+        </w:rPr>
+      </w:pPr>
+      <w:r>
+        <w:t xml:space="preserve">- </w:t>
+      </w:r>
+      <w:r>
+        <w:rPr>
+          <w:b/>
+          <w:highlight w:val="red"/>
+        </w:rPr>
+        <w:t>Garantir que ao criar novos diagnósticos eles fiquem ordenados pela ordem de criação na plataforma</w:t>
+      </w:r>
+      <w:r>
+        <w:rPr>
+          <w:b/>
+        </w:rPr>
+        <w:t xml:space="preserve"> (ordenar por horário-hora q o aluno entregou o simulado)</w:t>
+      </w:r>
+      <w:r>
+        <w:rPr>
+          <w:b/>
+        </w:rPr>
+        <w:t xml:space="preserve"> (2)</w:t>
+      </w:r>
+    </w:p>
+    <w:p>
+      <w:r>
+        <w:rPr>
+          <w:b/>
+        </w:rPr>
+        <w:tab/>
+      </w:r>
+      <w:r>
+        <w:t xml:space="preserve">- </w:t>
+      </w:r>
+      <w:proofErr w:type="spellStart"/>
+      <w:proofErr w:type="gramStart"/>
+      <w:r>
+        <w:t>backend</w:t>
+      </w:r>
+      <w:proofErr w:type="spellEnd"/>
+      <w:proofErr w:type="gramEnd"/>
+      <w:r>
+        <w:t xml:space="preserve">: </w:t>
+      </w:r>
+      <w:proofErr w:type="spellStart"/>
+      <w:r>
+        <w:t>refatoração</w:t>
+      </w:r>
+      <w:proofErr w:type="spellEnd"/>
+      <w:r>
+        <w:t xml:space="preserve"> de retorno de lista de diagnósticos ordenados.</w:t>
+      </w:r>
+    </w:p>
+    <w:p/>
+    <w:p>
+      <w:pPr>
+        <w:rPr>
+          <w:b/>
+          <w:highlight w:val="lightGray"/>
+        </w:rPr>
+      </w:pPr>
+      <w:r>
+        <w:t xml:space="preserve">- </w:t>
+      </w:r>
+      <w:r>
+        <w:rPr>
+          <w:b/>
+          <w:highlight w:val="lightGray"/>
+        </w:rPr>
+        <w:t>Possibilitar fazer download de vários diagnósticos ao mesmo tempo (ter campo de seleção individual e de seleção de todos)</w:t>
+      </w:r>
+      <w:r>
+        <w:rPr>
+          <w:b/>
+          <w:highlight w:val="lightGray"/>
+        </w:rPr>
+        <w:t xml:space="preserve"> (3)</w:t>
+      </w:r>
+    </w:p>
+    <w:p>
+      <w:pPr>
+        <w:rPr>
+          <w:highlight w:val="lightGray"/>
+        </w:rPr>
+      </w:pPr>
+      <w:r>
+        <w:rPr>
+          <w:b/>
+          <w:highlight w:val="lightGray"/>
+        </w:rPr>
+        <w:tab/>
+        <w:t xml:space="preserve">- </w:t>
+      </w:r>
+      <w:proofErr w:type="spellStart"/>
+      <w:proofErr w:type="gramStart"/>
+      <w:r>
+        <w:rPr>
+          <w:highlight w:val="lightGray"/>
+        </w:rPr>
+        <w:t>frontend</w:t>
+      </w:r>
+      <w:proofErr w:type="spellEnd"/>
+      <w:proofErr w:type="gramEnd"/>
+      <w:r>
+        <w:rPr>
+          <w:highlight w:val="lightGray"/>
+        </w:rPr>
+        <w:t xml:space="preserve">: </w:t>
+      </w:r>
+      <w:proofErr w:type="spellStart"/>
+      <w:r>
+        <w:rPr>
+          <w:highlight w:val="lightGray"/>
+        </w:rPr>
+        <w:t>refatorar</w:t>
+      </w:r>
+      <w:proofErr w:type="spellEnd"/>
+      <w:r>
+        <w:rPr>
+          <w:highlight w:val="lightGray"/>
+        </w:rPr>
+        <w:t xml:space="preserve"> a página para implementar a funcionalidade</w:t>
+      </w:r>
+    </w:p>
+    <w:p>
+      <w:r>
+        <w:rPr>
+          <w:highlight w:val="lightGray"/>
+        </w:rPr>
+        <w:tab/>
+        <w:t xml:space="preserve">- </w:t>
+      </w:r>
+      <w:proofErr w:type="spellStart"/>
+      <w:proofErr w:type="gramStart"/>
+      <w:r>
+        <w:rPr>
+          <w:highlight w:val="lightGray"/>
+        </w:rPr>
+        <w:t>backend</w:t>
+      </w:r>
+      <w:proofErr w:type="spellEnd"/>
+      <w:proofErr w:type="gramEnd"/>
+      <w:r>
+        <w:rPr>
+          <w:highlight w:val="lightGray"/>
+        </w:rPr>
+        <w:t xml:space="preserve">: criar </w:t>
+      </w:r>
+      <w:proofErr w:type="spellStart"/>
+      <w:r>
+        <w:rPr>
+          <w:highlight w:val="lightGray"/>
+        </w:rPr>
+        <w:t>endpoint</w:t>
+      </w:r>
+      <w:proofErr w:type="spellEnd"/>
+      <w:r>
+        <w:rPr>
+          <w:highlight w:val="lightGray"/>
+        </w:rPr>
+        <w:t xml:space="preserve"> para fazer download de vários diagnósticos.</w:t>
+      </w:r>
+    </w:p>
+    <w:p/>
+    <w:p>
+      <w:pPr>
+        <w:rPr>
+          <w:b/>
+          <w:highlight w:val="lightGray"/>
+        </w:rPr>
+      </w:pPr>
+      <w:r>
+        <w:rPr>
+          <w:highlight w:val="lightGray"/>
+        </w:rPr>
+        <w:t xml:space="preserve">- </w:t>
+      </w:r>
+      <w:r>
+        <w:rPr>
+          <w:b/>
+          <w:highlight w:val="lightGray"/>
+        </w:rPr>
+        <w:t>Possibilitar fazer exclusão de vários diagnósticos ao mesmo tempo (ter campo de seleção individual e de seleção de todos)</w:t>
+      </w:r>
+    </w:p>
+    <w:p>
+      <w:pPr>
+        <w:rPr>
+          <w:highlight w:val="lightGray"/>
+        </w:rPr>
+      </w:pPr>
+      <w:r>
+        <w:rPr>
+          <w:b/>
+          <w:highlight w:val="lightGray"/>
+        </w:rPr>
+        <w:tab/>
+      </w:r>
+      <w:r>
+        <w:rPr>
+          <w:highlight w:val="lightGray"/>
+        </w:rPr>
+        <w:t xml:space="preserve">- </w:t>
+      </w:r>
+      <w:proofErr w:type="spellStart"/>
+      <w:proofErr w:type="gramStart"/>
+      <w:r>
+        <w:rPr>
+          <w:highlight w:val="lightGray"/>
+        </w:rPr>
+        <w:t>frontend</w:t>
+      </w:r>
+      <w:proofErr w:type="spellEnd"/>
+      <w:proofErr w:type="gramEnd"/>
+      <w:r>
+        <w:rPr>
+          <w:highlight w:val="lightGray"/>
+        </w:rPr>
+        <w:t xml:space="preserve">: </w:t>
+      </w:r>
+      <w:proofErr w:type="spellStart"/>
+      <w:r>
+        <w:rPr>
+          <w:highlight w:val="lightGray"/>
+        </w:rPr>
+        <w:t>refatorar</w:t>
+      </w:r>
+      <w:proofErr w:type="spellEnd"/>
+      <w:r>
+        <w:rPr>
+          <w:highlight w:val="lightGray"/>
+        </w:rPr>
+        <w:t xml:space="preserve"> a página para implementar a funcionalidade</w:t>
+      </w:r>
+    </w:p>
+    <w:p>
+      <w:r>
+        <w:rPr>
+          <w:highlight w:val="lightGray"/>
+        </w:rPr>
+        <w:tab/>
+        <w:t xml:space="preserve">- </w:t>
+      </w:r>
+      <w:proofErr w:type="spellStart"/>
+      <w:proofErr w:type="gramStart"/>
+      <w:r>
+        <w:rPr>
+          <w:highlight w:val="lightGray"/>
+        </w:rPr>
+        <w:t>backend</w:t>
+      </w:r>
+      <w:proofErr w:type="spellEnd"/>
+      <w:proofErr w:type="gramEnd"/>
+      <w:r>
+        <w:rPr>
+          <w:highlight w:val="lightGray"/>
+        </w:rPr>
+        <w:t xml:space="preserve">: criar </w:t>
+      </w:r>
+      <w:proofErr w:type="spellStart"/>
+      <w:r>
+        <w:rPr>
+          <w:highlight w:val="lightGray"/>
+        </w:rPr>
+        <w:t>endpoint</w:t>
+      </w:r>
+      <w:proofErr w:type="spellEnd"/>
+      <w:r>
+        <w:rPr>
+          <w:highlight w:val="lightGray"/>
+        </w:rPr>
+        <w:t xml:space="preserve"> para deletar vários diagnósticos ao mesmo tempo.</w:t>
+      </w:r>
+    </w:p>
+    <w:p>
       <w:bookmarkStart w:id="0" w:name="_GoBack"/>
       <w:bookmarkEnd w:id="0"/>
     </w:p>
-    <w:p>
-      <w:pPr>
-        <w:ind w:firstLine="708"/>
-        <w:rPr>
-          <w:b/>
-        </w:rPr>
-      </w:pPr>
-      <w:r>
-        <w:rPr>
-          <w:b/>
-        </w:rPr>
-        <w:t xml:space="preserve">- </w:t>
-      </w:r>
-      <w:proofErr w:type="gramStart"/>
-      <w:r>
-        <w:rPr>
-          <w:b/>
-        </w:rPr>
-        <w:t>recupera</w:t>
-      </w:r>
-      <w:proofErr w:type="gramEnd"/>
-      <w:r>
-        <w:rPr>
-          <w:b/>
-        </w:rPr>
-        <w:t xml:space="preserve"> as informações anteriores.</w:t>
-      </w:r>
-    </w:p>
-    <w:p>
-      <w:pPr>
-        <w:ind w:firstLine="708"/>
-      </w:pPr>
-      <w:r>
-        <w:rPr>
-          <w:b/>
-        </w:rPr>
-        <w:t xml:space="preserve">- </w:t>
-      </w:r>
-      <w:proofErr w:type="gramStart"/>
-      <w:r>
-        <w:rPr>
-          <w:b/>
-        </w:rPr>
-        <w:t>envio</w:t>
-      </w:r>
-      <w:proofErr w:type="gramEnd"/>
-      <w:r>
-        <w:rPr>
-          <w:b/>
-        </w:rPr>
-        <w:t xml:space="preserve"> do relatório via aplicação.</w:t>
-      </w:r>
-      <w:r>
-        <w:br w:type="page"/>
-      </w:r>
-    </w:p>
-    <w:p>
-      <w:r>
-        <w:lastRenderedPageBreak/>
-        <w:t>LISTA</w:t>
-      </w:r>
-      <w:r>
-        <w:t xml:space="preserve"> DE DIAGNÓSTICOS</w:t>
-      </w:r>
-    </w:p>
-    <w:p>
-      <w:pPr>
-        <w:rPr>
-          <w:b/>
-        </w:rPr>
-      </w:pPr>
-      <w:r>
-        <w:t xml:space="preserve">- </w:t>
-      </w:r>
-      <w:r>
-        <w:rPr>
-          <w:b/>
-          <w:highlight w:val="red"/>
-        </w:rPr>
-        <w:t>Garantir que ao criar novos diagnósticos eles fiquem ordenados pela ordem de criação na plataforma</w:t>
-      </w:r>
-      <w:r>
-        <w:rPr>
-          <w:b/>
-        </w:rPr>
-        <w:t xml:space="preserve"> (ordenar por horário-hora q o aluno entregou o simulado)</w:t>
-      </w:r>
-      <w:r>
-        <w:rPr>
-          <w:b/>
-        </w:rPr>
-        <w:t xml:space="preserve"> (2)</w:t>
-      </w:r>
-    </w:p>
-    <w:p>
-      <w:r>
-        <w:rPr>
-          <w:b/>
-        </w:rPr>
-        <w:tab/>
-      </w:r>
-      <w:r>
-        <w:t xml:space="preserve">- </w:t>
-      </w:r>
-      <w:proofErr w:type="spellStart"/>
-      <w:proofErr w:type="gramStart"/>
-      <w:r>
-        <w:t>backend</w:t>
-      </w:r>
-      <w:proofErr w:type="spellEnd"/>
-      <w:proofErr w:type="gramEnd"/>
-      <w:r>
-        <w:t xml:space="preserve">: </w:t>
-      </w:r>
-      <w:proofErr w:type="spellStart"/>
-      <w:r>
-        <w:t>refatoração</w:t>
-      </w:r>
-      <w:proofErr w:type="spellEnd"/>
-      <w:r>
-        <w:t xml:space="preserve"> de retorno de lista de diagnósticos ordenados.</w:t>
-      </w:r>
-    </w:p>
-    <w:p/>
-    <w:p>
-      <w:pPr>
-        <w:rPr>
-          <w:b/>
-        </w:rPr>
-      </w:pPr>
-      <w:r>
-        <w:t xml:space="preserve">- </w:t>
-      </w:r>
-      <w:r>
-        <w:rPr>
-          <w:b/>
-          <w:highlight w:val="red"/>
-        </w:rPr>
-        <w:t>Possibilitar fazer download de vários diagnósticos ao mesmo tempo (ter campo de seleção individual e de seleção de todos)</w:t>
-      </w:r>
-      <w:r>
-        <w:rPr>
-          <w:b/>
-        </w:rPr>
-        <w:t xml:space="preserve"> (3)</w:t>
-      </w:r>
-    </w:p>
-    <w:p>
-      <w:r>
-        <w:rPr>
-          <w:b/>
-        </w:rPr>
-        <w:tab/>
-        <w:t xml:space="preserve">- </w:t>
-      </w:r>
-      <w:proofErr w:type="spellStart"/>
-      <w:proofErr w:type="gramStart"/>
-      <w:r>
-        <w:t>frontend</w:t>
-      </w:r>
-      <w:proofErr w:type="spellEnd"/>
-      <w:proofErr w:type="gramEnd"/>
-      <w:r>
-        <w:t xml:space="preserve">: </w:t>
-      </w:r>
-      <w:proofErr w:type="spellStart"/>
-      <w:r>
-        <w:t>refatorar</w:t>
-      </w:r>
-      <w:proofErr w:type="spellEnd"/>
-      <w:r>
-        <w:t xml:space="preserve"> a página para implementar a funcionalidade</w:t>
-      </w:r>
-    </w:p>
-    <w:p>
-      <w:r>
-        <w:tab/>
-      </w:r>
-      <w:r>
-        <w:t xml:space="preserve">- </w:t>
-      </w:r>
-      <w:proofErr w:type="spellStart"/>
-      <w:proofErr w:type="gramStart"/>
-      <w:r>
-        <w:t>backend</w:t>
-      </w:r>
-      <w:proofErr w:type="spellEnd"/>
-      <w:proofErr w:type="gramEnd"/>
-      <w:r>
-        <w:t xml:space="preserve">: criar </w:t>
-      </w:r>
-      <w:proofErr w:type="spellStart"/>
-      <w:r>
-        <w:t>endpoint</w:t>
-      </w:r>
-      <w:proofErr w:type="spellEnd"/>
-      <w:r>
-        <w:t xml:space="preserve"> para fazer down</w:t>
-      </w:r>
-      <w:r>
-        <w:t>load de vá</w:t>
-      </w:r>
-      <w:r>
-        <w:t>rios dia</w:t>
-      </w:r>
-      <w:r>
-        <w:t>gnósticos.</w:t>
-      </w:r>
-    </w:p>
-    <w:p/>
-    <w:p>
-      <w:pPr>
-        <w:rPr>
-          <w:b/>
-          <w:highlight w:val="lightGray"/>
-        </w:rPr>
-      </w:pPr>
-      <w:r>
-        <w:rPr>
-          <w:highlight w:val="lightGray"/>
-        </w:rPr>
-        <w:t xml:space="preserve">- </w:t>
-      </w:r>
-      <w:r>
-        <w:rPr>
-          <w:b/>
-          <w:highlight w:val="lightGray"/>
-        </w:rPr>
-        <w:t>Possibilitar fazer exclusão de vários diagnósticos ao mesmo tempo (ter campo de seleção individual e de seleção de todos)</w:t>
-      </w:r>
-    </w:p>
-    <w:p>
-      <w:pPr>
-        <w:rPr>
-          <w:highlight w:val="lightGray"/>
-        </w:rPr>
-      </w:pPr>
-      <w:r>
-        <w:rPr>
-          <w:b/>
-          <w:highlight w:val="lightGray"/>
-        </w:rPr>
-        <w:tab/>
-      </w:r>
-      <w:r>
-        <w:rPr>
-          <w:highlight w:val="lightGray"/>
-        </w:rPr>
-        <w:t xml:space="preserve">- </w:t>
-      </w:r>
-      <w:proofErr w:type="spellStart"/>
-      <w:proofErr w:type="gramStart"/>
-      <w:r>
-        <w:rPr>
-          <w:highlight w:val="lightGray"/>
-        </w:rPr>
-        <w:t>frontend</w:t>
-      </w:r>
-      <w:proofErr w:type="spellEnd"/>
-      <w:proofErr w:type="gramEnd"/>
-      <w:r>
-        <w:rPr>
-          <w:highlight w:val="lightGray"/>
-        </w:rPr>
-        <w:t xml:space="preserve">: </w:t>
-      </w:r>
-      <w:proofErr w:type="spellStart"/>
-      <w:r>
-        <w:rPr>
-          <w:highlight w:val="lightGray"/>
-        </w:rPr>
-        <w:t>refatorar</w:t>
-      </w:r>
-      <w:proofErr w:type="spellEnd"/>
-      <w:r>
-        <w:rPr>
-          <w:highlight w:val="lightGray"/>
-        </w:rPr>
-        <w:t xml:space="preserve"> a página para implementar a funcionalidade</w:t>
-      </w:r>
-    </w:p>
-    <w:p>
-      <w:r>
-        <w:rPr>
-          <w:highlight w:val="lightGray"/>
-        </w:rPr>
-        <w:tab/>
-        <w:t xml:space="preserve">- </w:t>
-      </w:r>
-      <w:proofErr w:type="spellStart"/>
-      <w:proofErr w:type="gramStart"/>
-      <w:r>
-        <w:rPr>
-          <w:highlight w:val="lightGray"/>
-        </w:rPr>
-        <w:t>backend</w:t>
-      </w:r>
-      <w:proofErr w:type="spellEnd"/>
-      <w:proofErr w:type="gramEnd"/>
-      <w:r>
-        <w:rPr>
-          <w:highlight w:val="lightGray"/>
-        </w:rPr>
-        <w:t xml:space="preserve">: criar </w:t>
-      </w:r>
-      <w:proofErr w:type="spellStart"/>
-      <w:r>
-        <w:rPr>
-          <w:highlight w:val="lightGray"/>
-        </w:rPr>
-        <w:t>endpoint</w:t>
-      </w:r>
-      <w:proofErr w:type="spellEnd"/>
-      <w:r>
-        <w:rPr>
-          <w:highlight w:val="lightGray"/>
-        </w:rPr>
-        <w:t xml:space="preserve"> para deletar vários diagnósticos ao mesmo tempo.</w:t>
-      </w:r>
-    </w:p>
-    <w:p/>
     <w:p>
       <w:pPr>
         <w:rPr>

</xml_diff>

<commit_message>
feat: implementação dos componente de dashboard
</commit_message>
<xml_diff>
--- a/melhorias_docs/Report-generator melhorias v2.docx
+++ b/melhorias_docs/Report-generator melhorias v2.docx
@@ -628,6 +628,7 @@
     </w:p>
     <w:p>
       <w:pPr>
+        <w:shd w:val="clear" w:color="auto" w:fill="BFBFBF" w:themeFill="background1" w:themeFillShade="BF"/>
         <w:rPr>
           <w:b/>
         </w:rPr>
@@ -642,6 +643,7 @@
         <w:rPr>
           <w:b/>
           <w:highlight w:val="red"/>
+          <w:shd w:val="clear" w:color="auto" w:fill="D9D9D9" w:themeFill="background1" w:themeFillShade="D9"/>
         </w:rPr>
         <w:t xml:space="preserve">Verificar relação de </w:t>
       </w:r>
@@ -650,6 +652,7 @@
         <w:rPr>
           <w:b/>
           <w:highlight w:val="red"/>
+          <w:shd w:val="clear" w:color="auto" w:fill="D9D9D9" w:themeFill="background1" w:themeFillShade="D9"/>
         </w:rPr>
         <w:t>email</w:t>
       </w:r>
@@ -658,6 +661,7 @@
         <w:rPr>
           <w:b/>
           <w:highlight w:val="red"/>
+          <w:shd w:val="clear" w:color="auto" w:fill="D9D9D9" w:themeFill="background1" w:themeFillShade="D9"/>
         </w:rPr>
         <w:t xml:space="preserve"> e atualização de </w:t>
       </w:r>
@@ -666,6 +670,7 @@
         <w:rPr>
           <w:b/>
           <w:highlight w:val="red"/>
+          <w:shd w:val="clear" w:color="auto" w:fill="D9D9D9" w:themeFill="background1" w:themeFillShade="D9"/>
         </w:rPr>
         <w:t>email</w:t>
       </w:r>
@@ -673,18 +678,21 @@
       <w:r>
         <w:rPr>
           <w:b/>
+          <w:shd w:val="clear" w:color="auto" w:fill="D9D9D9" w:themeFill="background1" w:themeFillShade="D9"/>
         </w:rPr>
         <w:t xml:space="preserve"> (5)</w:t>
       </w:r>
       <w:r>
         <w:rPr>
           <w:b/>
+          <w:shd w:val="clear" w:color="auto" w:fill="D9D9D9" w:themeFill="background1" w:themeFillShade="D9"/>
         </w:rPr>
         <w:t>:</w:t>
       </w:r>
     </w:p>
     <w:p>
       <w:pPr>
+        <w:shd w:val="clear" w:color="auto" w:fill="BFBFBF" w:themeFill="background1" w:themeFillShade="BF"/>
         <w:ind w:firstLine="708"/>
         <w:rPr>
           <w:b/>
@@ -715,26 +723,6 @@
       <w:pPr>
         <w:ind w:firstLine="708"/>
       </w:pPr>
-      <w:r>
-        <w:rPr>
-          <w:b/>
-        </w:rPr>
-        <w:t xml:space="preserve">- </w:t>
-      </w:r>
-      <w:proofErr w:type="gramStart"/>
-      <w:r>
-        <w:rPr>
-          <w:b/>
-        </w:rPr>
-        <w:t>envio</w:t>
-      </w:r>
-      <w:proofErr w:type="gramEnd"/>
-      <w:r>
-        <w:rPr>
-          <w:b/>
-        </w:rPr>
-        <w:t xml:space="preserve"> do relatório via aplicação.</w:t>
-      </w:r>
       <w:r>
         <w:br w:type="page"/>
       </w:r>
@@ -757,6 +745,7 @@
       <w:r>
         <w:t xml:space="preserve">- </w:t>
       </w:r>
+      <w:bookmarkStart w:id="0" w:name="_GoBack"/>
       <w:r>
         <w:rPr>
           <w:b/>
@@ -806,6 +795,7 @@
         <w:t xml:space="preserve"> de retorno de lista de diagnósticos ordenados.</w:t>
       </w:r>
     </w:p>
+    <w:bookmarkEnd w:id="0"/>
     <w:p/>
     <w:p>
       <w:pPr>
@@ -1027,10 +1017,7 @@
         <w:t xml:space="preserve"> para deletar vários diagnósticos ao mesmo tempo.</w:t>
       </w:r>
     </w:p>
-    <w:p>
-      <w:bookmarkStart w:id="0" w:name="_GoBack"/>
-      <w:bookmarkEnd w:id="0"/>
-    </w:p>
+    <w:p/>
     <w:p>
       <w:pPr>
         <w:rPr>

</xml_diff>

<commit_message>
refactor: refatora as requisições q passam array como argumento, cria endpoint dedicado para recuperar os simulados de um aluno por ano, refatoração de UI
</commit_message>
<xml_diff>
--- a/melhorias_docs/Report-generator melhorias v2.docx
+++ b/melhorias_docs/Report-generator melhorias v2.docx
@@ -25,6 +25,12 @@
         </w:rPr>
         <w:t xml:space="preserve"> (4)</w:t>
       </w:r>
+      <w:r>
+        <w:rPr>
+          <w:b/>
+        </w:rPr>
+        <w:t xml:space="preserve"> - Completo</w:t>
+      </w:r>
     </w:p>
     <w:p/>
     <w:p>
@@ -48,6 +54,13 @@
         </w:rPr>
         <w:t>Reordenar questões do simulados</w:t>
       </w:r>
+      <w:r>
+        <w:rPr>
+          <w:b/>
+          <w:highlight w:val="lightGray"/>
+        </w:rPr>
+        <w:t xml:space="preserve"> - Completo</w:t>
+      </w:r>
     </w:p>
     <w:p>
       <w:pPr>
@@ -205,6 +218,13 @@
         </w:rPr>
         <w:t>Duplicar simulado</w:t>
       </w:r>
+      <w:r>
+        <w:rPr>
+          <w:b/>
+          <w:highlight w:val="lightGray"/>
+        </w:rPr>
+        <w:t xml:space="preserve"> - Completo</w:t>
+      </w:r>
     </w:p>
     <w:p>
       <w:pPr>
@@ -241,6 +261,8 @@
         </w:rPr>
         <w:t>: implementar o ícone para esse funcionalidade.</w:t>
       </w:r>
+      <w:bookmarkStart w:id="0" w:name="_GoBack"/>
+      <w:bookmarkEnd w:id="0"/>
     </w:p>
     <w:p>
       <w:r>
@@ -290,8 +312,10 @@
     </w:p>
     <w:p>
       <w:pPr>
-        <w:rPr>
-          <w:b/>
+        <w:shd w:val="clear" w:color="auto" w:fill="D0CECE" w:themeFill="background2" w:themeFillShade="E6"/>
+        <w:rPr>
+          <w:b/>
+          <w:u w:val="single"/>
         </w:rPr>
       </w:pPr>
       <w:r>
@@ -313,8 +337,17 @@
         <w:t>excel</w:t>
       </w:r>
       <w:proofErr w:type="spellEnd"/>
-    </w:p>
-    <w:p>
+      <w:r>
+        <w:rPr>
+          <w:b/>
+        </w:rPr>
+        <w:t xml:space="preserve"> - Completo</w:t>
+      </w:r>
+    </w:p>
+    <w:p>
+      <w:pPr>
+        <w:shd w:val="clear" w:color="auto" w:fill="D0CECE" w:themeFill="background2" w:themeFillShade="E6"/>
+      </w:pPr>
       <w:r>
         <w:rPr>
           <w:b/>
@@ -342,6 +375,9 @@
       </w:r>
     </w:p>
     <w:p>
+      <w:pPr>
+        <w:shd w:val="clear" w:color="auto" w:fill="D0CECE" w:themeFill="background2" w:themeFillShade="E6"/>
+      </w:pPr>
       <w:r>
         <w:tab/>
         <w:t xml:space="preserve">- </w:t>
@@ -406,6 +442,13 @@
         </w:rPr>
         <w:t xml:space="preserve"> (1)</w:t>
       </w:r>
+      <w:r>
+        <w:rPr>
+          <w:b/>
+          <w:highlight w:val="lightGray"/>
+        </w:rPr>
+        <w:t xml:space="preserve"> - Completo</w:t>
+      </w:r>
     </w:p>
     <w:p>
       <w:pPr>
@@ -575,6 +618,12 @@
         </w:rPr>
         <w:t>nciona com um modelo específico</w:t>
       </w:r>
+      <w:r>
+        <w:rPr>
+          <w:b/>
+        </w:rPr>
+        <w:t xml:space="preserve"> - Completo</w:t>
+      </w:r>
     </w:p>
     <w:p>
       <w:pPr>
@@ -624,6 +673,12 @@
           <w:highlight w:val="lightGray"/>
         </w:rPr>
         <w:t xml:space="preserve"> e formatação de alguns campos.</w:t>
+      </w:r>
+      <w:r>
+        <w:rPr>
+          <w:b/>
+        </w:rPr>
+        <w:t xml:space="preserve"> - Completo</w:t>
       </w:r>
     </w:p>
     <w:p>
@@ -689,6 +744,13 @@
         </w:rPr>
         <w:t>:</w:t>
       </w:r>
+      <w:r>
+        <w:rPr>
+          <w:b/>
+          <w:shd w:val="clear" w:color="auto" w:fill="D9D9D9" w:themeFill="background1" w:themeFillShade="D9"/>
+        </w:rPr>
+        <w:t xml:space="preserve"> - Não foi aprovado</w:t>
+      </w:r>
     </w:p>
     <w:p>
       <w:pPr>
@@ -745,7 +807,6 @@
       <w:r>
         <w:t xml:space="preserve">- </w:t>
       </w:r>
-      <w:bookmarkStart w:id="0" w:name="_GoBack"/>
       <w:r>
         <w:rPr>
           <w:b/>
@@ -765,6 +826,12 @@
         </w:rPr>
         <w:t xml:space="preserve"> (2)</w:t>
       </w:r>
+      <w:r>
+        <w:rPr>
+          <w:b/>
+        </w:rPr>
+        <w:t xml:space="preserve"> - Completo</w:t>
+      </w:r>
     </w:p>
     <w:p>
       <w:r>
@@ -795,7 +862,6 @@
         <w:t xml:space="preserve"> de retorno de lista de diagnósticos ordenados.</w:t>
       </w:r>
     </w:p>
-    <w:bookmarkEnd w:id="0"/>
     <w:p/>
     <w:p>
       <w:pPr>
@@ -821,6 +887,13 @@
         </w:rPr>
         <w:t xml:space="preserve"> (3)</w:t>
       </w:r>
+      <w:r>
+        <w:rPr>
+          <w:b/>
+          <w:highlight w:val="lightGray"/>
+        </w:rPr>
+        <w:t xml:space="preserve"> - Completo</w:t>
+      </w:r>
     </w:p>
     <w:p>
       <w:pPr>
@@ -926,6 +999,13 @@
           <w:highlight w:val="lightGray"/>
         </w:rPr>
         <w:t>Possibilitar fazer exclusão de vários diagnósticos ao mesmo tempo (ter campo de seleção individual e de seleção de todos)</w:t>
+      </w:r>
+      <w:r>
+        <w:rPr>
+          <w:b/>
+          <w:highlight w:val="lightGray"/>
+        </w:rPr>
+        <w:t xml:space="preserve"> - Completo</w:t>
       </w:r>
     </w:p>
     <w:p>

</xml_diff>